<commit_message>
Auto commit (2026-10-14 16:29) — 7 changes
Claude Code 세션 종료 시 자동 커밋.

Co-Authored-By: Claude <noreply@anthropic.com>
</commit_message>
<xml_diff>
--- a/projects/36_slave_dragon_king/노예라 불린 용의 공주_작가 대본 2.0(1-8화)_한국어 번역본.docx
+++ b/projects/36_slave_dragon_king/노예라 불린 용의 공주_작가 대본 2.0(1-8화)_한국어 번역본.docx
@@ -2005,21 +2005,6 @@
           <w:sz w:val="21"/>
         </w:rPr>
         <w:t>△ 아이비가 믿기지 않는다는 듯 엎드린 짐승 용을 본다.</w:t>
-      </w:r>
-    </w:p>
-    <w:p>
-      <w:pPr>
-        <w:keepNext w:val="0"/>
-        <w:spacing w:after="100" w:before="0" w:line="317" w:lineRule="auto"/>
-      </w:pPr>
-      <w:r>
-        <w:rPr>
-          <w:rFonts w:ascii="맑은 고딕" w:hAnsi="맑은 고딕" w:eastAsia="맑은 고딕"/>
-          <w:b w:val="0"/>
-          <w:color w:val="444444"/>
-          <w:sz w:val="21"/>
-        </w:rPr>
-        <w:t>△ 엎드린 짐승 용이 고개를 숙인 채, 아이비 발목의 쇠사슬을 물어 끊는다.</w:t>
       </w:r>
     </w:p>
     <w:p>

</xml_diff>